<commit_message>
Fix Python Anywhere brandSection ReferenceError - Fixed scope issue in updateSelectedTags function that was preventing tag selection functionality
</commit_message>
<xml_diff>
--- a/src/core/generation/templates/horizontal.docx
+++ b/src/core/generation/templates/horizontal.docx
@@ -154,7 +154,6 @@
               </w:rPr>
               <w:t>Lineage</w:t>
             </w:r>
-            <w:proofErr w:type="gramStart"/>
             <w:r>
               <w:rPr>
                 <w:rFonts w:ascii="Arial" w:hAnsi="Arial" w:cs="Arial"/>
@@ -177,28 +176,10 @@
             </w:r>
             <w:r>
               <w:rPr>
-                <w:rFonts w:ascii="Arial" w:hAnsi="Arial" w:cs="Arial"/>
-                <w:b/>
-                <w:bCs/>
-                <w:sz w:val="18"/>
-                <w:szCs w:val="18"/>
-              </w:rPr>
-              <w:t xml:space="preserve"> </w:t>
-            </w:r>
-            <w:r>
-              <w:rPr>
                 <w:sz w:val="13"/>
                 <w:szCs w:val="13"/>
               </w:rPr>
-              <w:t>{</w:t>
-            </w:r>
-            <w:proofErr w:type="gramEnd"/>
-            <w:r>
-              <w:rPr>
-                <w:sz w:val="13"/>
-                <w:szCs w:val="13"/>
-              </w:rPr>
-              <w:t>{Label1.ProductVendor}}</w:t>
+              <w:t>{{Label1.ProductVendor}}</w:t>
             </w:r>
           </w:p>
           <w:p>
@@ -266,10 +247,12 @@
                   <w:shd w:val="clear" w:color="auto" w:fill="FFFFFF" w:themeFill="background1"/>
                   <w:noWrap/>
                   <w:tcMar>
-                    <w:top w:w="72" w:type="dxa"/>
-                    <w:left w:w="115" w:type="dxa"/>
-                    <w:right w:w="14" w:type="dxa"/>
+                    <w:top w:w="144" w:type="dxa"/>
+                    <w:left w:w="43" w:type="dxa"/>
+                    <w:bottom w:w="43" w:type="dxa"/>
+                    <w:right w:w="43" w:type="dxa"/>
                   </w:tcMar>
+                  <w:vAlign w:val="center"/>
                 </w:tcPr>
                 <w:p>
                   <w:pPr>
@@ -306,11 +289,12 @@
                   <w:shd w:val="clear" w:color="auto" w:fill="FFFFFF" w:themeFill="background1"/>
                   <w:noWrap/>
                   <w:tcMar>
-                    <w:top w:w="29" w:type="dxa"/>
-                    <w:left w:w="29" w:type="dxa"/>
-                    <w:right w:w="29" w:type="dxa"/>
+                    <w:top w:w="144" w:type="dxa"/>
+                    <w:left w:w="43" w:type="dxa"/>
+                    <w:bottom w:w="43" w:type="dxa"/>
+                    <w:right w:w="43" w:type="dxa"/>
                   </w:tcMar>
-                  <w:vAlign w:val="bottom"/>
+                  <w:vAlign w:val="center"/>
                 </w:tcPr>
                 <w:p>
                   <w:pPr>
@@ -348,10 +332,10 @@
                   <w:shd w:val="clear" w:color="auto" w:fill="FFFFFF" w:themeFill="background1"/>
                   <w:noWrap/>
                   <w:tcMar>
-                    <w:top w:w="29" w:type="dxa"/>
-                    <w:left w:w="29" w:type="dxa"/>
-                    <w:bottom w:w="29" w:type="dxa"/>
-                    <w:right w:w="29" w:type="dxa"/>
+                    <w:top w:w="144" w:type="dxa"/>
+                    <w:left w:w="43" w:type="dxa"/>
+                    <w:bottom w:w="43" w:type="dxa"/>
+                    <w:right w:w="43" w:type="dxa"/>
                   </w:tcMar>
                   <w:vAlign w:val="center"/>
                 </w:tcPr>

</xml_diff>

<commit_message>
Fix import paths for PythonAnywhere compatibility
- Convert all hardcoded 'from src.core.*' imports to relative imports
- Fix imports in template_processor.py, tag_generator.py, docx_formatting.py
- Fix imports in excel_processor.py, unified_font_sizing.py, font_sizing.py
- Fix imports in mini_font_sizing.py, text_processing.py
- Fix imports in ui components and gui components
- Ensure all core modules use relative imports for cross-platform compatibility
- Resolves PythonAnywhere import error: 'cannot import name remove_all_headers_and_footers'
</commit_message>
<xml_diff>
--- a/src/core/generation/templates/horizontal.docx
+++ b/src/core/generation/templates/horizontal.docx
@@ -58,7 +58,7 @@
             <w:tr>
               <w:trPr>
                 <w:cantSplit/>
-                <w:trHeight w:hRule="exact" w:val="1843"/>
+                <w:trHeight w:val="1848"/>
                 <w:jc w:val="center"/>
               </w:trPr>
               <w:tc>
@@ -239,7 +239,7 @@
           </w:p>
           <w:tbl>
             <w:tblPr>
-              <w:tblpPr w:leftFromText="288" w:rightFromText="288" w:vertAnchor="page" w:horzAnchor="margin" w:tblpXSpec="center" w:tblpY="2405"/>
+              <w:tblpPr w:leftFromText="288" w:rightFromText="288" w:vertAnchor="page" w:horzAnchor="margin" w:tblpXSpec="center" w:tblpY="2446"/>
               <w:tblOverlap w:val="never"/>
               <w:tblW w:w="4770" w:type="dxa"/>
               <w:jc w:val="center"/>
@@ -257,19 +257,19 @@
               <w:tblLook w:val="0000" w:firstRow="0" w:lastRow="0" w:firstColumn="0" w:lastColumn="0" w:noHBand="0" w:noVBand="0"/>
             </w:tblPr>
             <w:tblGrid>
-              <w:gridCol w:w="1800"/>
-              <w:gridCol w:w="1080"/>
-              <w:gridCol w:w="1890"/>
+              <w:gridCol w:w="1842"/>
+              <w:gridCol w:w="1087"/>
+              <w:gridCol w:w="1841"/>
             </w:tblGrid>
             <w:tr>
               <w:trPr>
                 <w:cantSplit/>
-                <w:trHeight w:hRule="exact" w:val="936"/>
+                <w:trHeight w:hRule="exact" w:val="885"/>
                 <w:jc w:val="center"/>
               </w:trPr>
               <w:tc>
                 <w:tcPr>
-                  <w:tcW w:w="1800" w:type="dxa"/>
+                  <w:tcW w:w="1829" w:type="dxa"/>
                   <w:tcBorders>
                     <w:top w:val="nil"/>
                     <w:left w:val="nil"/>
@@ -351,7 +351,7 @@
               </w:tc>
               <w:tc>
                 <w:tcPr>
-                  <w:tcW w:w="1890" w:type="dxa"/>
+                  <w:tcW w:w="1829" w:type="dxa"/>
                   <w:tcBorders>
                     <w:top w:val="nil"/>
                     <w:left w:val="nil"/>

</xml_diff>

<commit_message>
Fix ProductVendor/Lineage conflict and implement VendorInfo workaround
- Fixed circular dependency in Lineage logic for classic types
- Implemented VendorInfo field to avoid template corruption during expansion
- Updated horizontal template to include VendorInfo placeholder
- Fixed ProductVendor to use actual vendor data from Vendor column
- Added safety checks to prevent brand/vendor confusion
- Fixed template expansion XML copying issues
- Resolved 'dict' object has no attribute 'empty' error in format_classic_ratio
</commit_message>
<xml_diff>
--- a/src/core/generation/templates/horizontal.docx
+++ b/src/core/generation/templates/horizontal.docx
@@ -164,23 +164,6 @@
               </w:rPr>
               <w:t>}}</w:t>
             </w:r>
-            <w:r>
-              <w:rPr>
-                <w:rFonts w:ascii="Arial" w:hAnsi="Arial" w:cs="Arial"/>
-                <w:b/>
-                <w:bCs/>
-                <w:sz w:val="18"/>
-                <w:szCs w:val="18"/>
-              </w:rPr>
-              <w:t xml:space="preserve"> </w:t>
-            </w:r>
-            <w:r>
-              <w:rPr>
-                <w:sz w:val="13"/>
-                <w:szCs w:val="13"/>
-              </w:rPr>
-              <w:t>{{Label1.ProductVendor}}</w:t>
-            </w:r>
           </w:p>
           <w:p>
             <w:pPr>
@@ -202,7 +185,7 @@
                 <w:sz w:val="8"/>
                 <w:szCs w:val="8"/>
               </w:rPr>
-              <w:t>{{Label1.ProductStrain}}</w:t>
+              <w:t>{{Label1.ProductStrain}}{{Label1.VendorInfo}}</w:t>
             </w:r>
           </w:p>
           <w:tbl>
@@ -368,6 +351,9 @@
     </w:tbl>
     <w:p>
       <w:pPr>
+        <w:tabs>
+          <w:tab w:val="left" w:pos="9083"/>
+        </w:tabs>
         <w:rPr>
           <w:sz w:val="18"/>
           <w:szCs w:val="18"/>

</xml_diff>

<commit_message>
Add test files and update templates
</commit_message>
<xml_diff>
--- a/src/core/generation/templates/horizontal.docx
+++ b/src/core/generation/templates/horizontal.docx
@@ -62,7 +62,7 @@
             <w:tr>
               <w:trPr>
                 <w:cantSplit/>
-                <w:trHeight w:val="1800"/>
+                <w:trHeight w:val="1663"/>
                 <w:jc w:val="center"/>
               </w:trPr>
               <w:tc>
@@ -234,10 +234,9 @@
           </w:p>
           <w:tbl>
             <w:tblPr>
-              <w:tblpPr w:leftFromText="288" w:rightFromText="288" w:vertAnchor="page" w:horzAnchor="margin" w:tblpXSpec="center" w:tblpY="2446"/>
+              <w:tblpPr w:leftFromText="288" w:rightFromText="288" w:vertAnchor="page" w:horzAnchor="margin" w:tblpXSpec="center" w:tblpY="2309"/>
               <w:tblOverlap w:val="never"/>
               <w:tblW w:w="4680" w:type="dxa"/>
-              <w:jc w:val="center"/>
               <w:tblBorders>
                 <w:top w:val="single" w:sz="4" w:space="0" w:color="FFFFFF" w:themeColor="background1"/>
                 <w:left w:val="single" w:sz="4" w:space="0" w:color="FFFFFF" w:themeColor="background1"/>
@@ -259,8 +258,7 @@
             <w:tr>
               <w:trPr>
                 <w:cantSplit/>
-                <w:trHeight w:hRule="exact" w:val="792"/>
-                <w:jc w:val="center"/>
+                <w:trHeight w:hRule="exact" w:val="969"/>
               </w:trPr>
               <w:tc>
                 <w:tcPr>

</xml_diff>

<commit_message>
Improve JSON matching and template processing
JSON Matcher improvements:
- Store full row data in cache (_db_product field)
- Better extraction of database product from cache
- Enhanced logging for product name extraction
- Use JSON name as fallback when DB product has no name

Template Processor improvements:
- Enhanced template marker processing
- Updated template files (horizontal, vertical)

These changes improve product matching reliability and template generation.
</commit_message>
<xml_diff>
--- a/src/core/generation/templates/horizontal.docx
+++ b/src/core/generation/templates/horizontal.docx
@@ -29,7 +29,7 @@
         </w:trPr>
         <w:tc>
           <w:tcPr>
-            <w:tcW w:w="4896" w:type="dxa"/>
+            <w:tcW w:w="4752" w:type="dxa"/>
             <w:noWrap/>
             <w:tcMar>
               <w:left w:w="58" w:type="dxa"/>
@@ -39,7 +39,7 @@
           </w:tcPr>
           <w:tbl>
             <w:tblPr>
-              <w:tblpPr w:leftFromText="187" w:rightFromText="187" w:vertAnchor="page" w:horzAnchor="margin" w:tblpXSpec="center" w:tblpY="33"/>
+              <w:tblpPr w:leftFromText="187" w:rightFromText="187" w:vertAnchor="page" w:horzAnchor="margin" w:tblpXSpec="center" w:tblpY="61"/>
               <w:tblOverlap w:val="never"/>
               <w:tblW w:w="4752" w:type="dxa"/>
               <w:jc w:val="center"/>
@@ -62,12 +62,12 @@
             <w:tr>
               <w:trPr>
                 <w:cantSplit/>
-                <w:trHeight w:val="1954"/>
+                <w:trHeight w:hRule="exact" w:val="1842"/>
                 <w:jc w:val="center"/>
               </w:trPr>
               <w:tc>
                 <w:tcPr>
-                  <w:tcW w:w="4824" w:type="dxa"/>
+                  <w:tcW w:w="4770" w:type="dxa"/>
                   <w:tcBorders>
                     <w:top w:val="nil"/>
                     <w:left w:val="nil"/>
@@ -76,14 +76,14 @@
                   </w:tcBorders>
                   <w:shd w:val="clear" w:color="auto" w:fill="FFFFFF" w:themeFill="background1"/>
                   <w:tcMar>
-                    <w:top w:w="29" w:type="dxa"/>
+                    <w:top w:w="43" w:type="dxa"/>
                     <w:left w:w="115" w:type="dxa"/>
                     <w:right w:w="115" w:type="dxa"/>
                   </w:tcMar>
                 </w:tcPr>
                 <w:p>
                   <w:pPr>
-                    <w:spacing w:line="228" w:lineRule="auto"/>
+                    <w:spacing w:line="216" w:lineRule="auto"/>
                     <w:rPr>
                       <w:rFonts w:ascii="Arial" w:hAnsi="Arial" w:cs="Arial"/>
                       <w:b/>
@@ -207,9 +207,9 @@
           </w:p>
           <w:tbl>
             <w:tblPr>
-              <w:tblpPr w:leftFromText="288" w:rightFromText="288" w:vertAnchor="page" w:horzAnchor="margin" w:tblpXSpec="center" w:tblpY="2492"/>
+              <w:tblpPr w:leftFromText="288" w:rightFromText="288" w:vertAnchor="page" w:horzAnchor="margin" w:tblpY="2420"/>
               <w:tblOverlap w:val="never"/>
-              <w:tblW w:w="4752" w:type="dxa"/>
+              <w:tblW w:w="4767" w:type="dxa"/>
               <w:tblBorders>
                 <w:top w:val="single" w:sz="4" w:space="0" w:color="FFFFFF" w:themeColor="background1"/>
                 <w:left w:val="single" w:sz="4" w:space="0" w:color="FFFFFF" w:themeColor="background1"/>
@@ -224,18 +224,18 @@
               <w:tblLook w:val="0000" w:firstRow="0" w:lastRow="0" w:firstColumn="0" w:lastColumn="0" w:noHBand="0" w:noVBand="0"/>
             </w:tblPr>
             <w:tblGrid>
-              <w:gridCol w:w="1883"/>
-              <w:gridCol w:w="1255"/>
-              <w:gridCol w:w="1614"/>
+              <w:gridCol w:w="1889"/>
+              <w:gridCol w:w="1259"/>
+              <w:gridCol w:w="1619"/>
             </w:tblGrid>
             <w:tr>
               <w:trPr>
                 <w:cantSplit/>
-                <w:trHeight w:hRule="exact" w:val="893"/>
+                <w:trHeight w:hRule="exact" w:val="936"/>
               </w:trPr>
               <w:tc>
                 <w:tcPr>
-                  <w:tcW w:w="1883" w:type="dxa"/>
+                  <w:tcW w:w="1889" w:type="dxa"/>
                   <w:tcBorders>
                     <w:top w:val="nil"/>
                     <w:left w:val="nil"/>
@@ -277,7 +277,7 @@
               </w:tc>
               <w:tc>
                 <w:tcPr>
-                  <w:tcW w:w="1255" w:type="dxa"/>
+                  <w:tcW w:w="1259" w:type="dxa"/>
                   <w:tcBorders>
                     <w:top w:val="nil"/>
                     <w:left w:val="nil"/>
@@ -320,7 +320,7 @@
               </w:tc>
               <w:tc>
                 <w:tcPr>
-                  <w:tcW w:w="1614" w:type="dxa"/>
+                  <w:tcW w:w="1619" w:type="dxa"/>
                   <w:tcBorders>
                     <w:top w:val="nil"/>
                     <w:left w:val="nil"/>

</xml_diff>

<commit_message>
chore: sync latest changes
</commit_message>
<xml_diff>
--- a/src/core/generation/templates/horizontal.docx
+++ b/src/core/generation/templates/horizontal.docx
@@ -29,7 +29,7 @@
         </w:trPr>
         <w:tc>
           <w:tcPr>
-            <w:tcW w:w="4752" w:type="dxa"/>
+            <w:tcW w:w="4896" w:type="dxa"/>
             <w:noWrap/>
             <w:tcMar>
               <w:left w:w="58" w:type="dxa"/>
@@ -67,7 +67,7 @@
               </w:trPr>
               <w:tc>
                 <w:tcPr>
-                  <w:tcW w:w="4770" w:type="dxa"/>
+                  <w:tcW w:w="4723" w:type="dxa"/>
                   <w:tcBorders>
                     <w:top w:val="nil"/>
                     <w:left w:val="nil"/>
@@ -76,7 +76,7 @@
                   </w:tcBorders>
                   <w:shd w:val="clear" w:color="auto" w:fill="FFFFFF" w:themeFill="background1"/>
                   <w:tcMar>
-                    <w:top w:w="43" w:type="dxa"/>
+                    <w:top w:w="29" w:type="dxa"/>
                     <w:left w:w="115" w:type="dxa"/>
                     <w:right w:w="115" w:type="dxa"/>
                   </w:tcMar>
@@ -207,9 +207,10 @@
           </w:p>
           <w:tbl>
             <w:tblPr>
-              <w:tblpPr w:leftFromText="288" w:rightFromText="288" w:vertAnchor="page" w:horzAnchor="margin" w:tblpY="2420"/>
+              <w:tblpPr w:leftFromText="288" w:rightFromText="288" w:vertAnchor="page" w:horzAnchor="margin" w:tblpXSpec="center" w:tblpY="2420"/>
               <w:tblOverlap w:val="never"/>
-              <w:tblW w:w="4767" w:type="dxa"/>
+              <w:tblW w:w="4752" w:type="dxa"/>
+              <w:jc w:val="center"/>
               <w:tblBorders>
                 <w:top w:val="single" w:sz="4" w:space="0" w:color="FFFFFF" w:themeColor="background1"/>
                 <w:left w:val="single" w:sz="4" w:space="0" w:color="FFFFFF" w:themeColor="background1"/>
@@ -224,18 +225,19 @@
               <w:tblLook w:val="0000" w:firstRow="0" w:lastRow="0" w:firstColumn="0" w:lastColumn="0" w:noHBand="0" w:noVBand="0"/>
             </w:tblPr>
             <w:tblGrid>
-              <w:gridCol w:w="1889"/>
-              <w:gridCol w:w="1259"/>
-              <w:gridCol w:w="1619"/>
+              <w:gridCol w:w="1882"/>
+              <w:gridCol w:w="1256"/>
+              <w:gridCol w:w="1614"/>
             </w:tblGrid>
             <w:tr>
               <w:trPr>
                 <w:cantSplit/>
                 <w:trHeight w:hRule="exact" w:val="936"/>
+                <w:jc w:val="center"/>
               </w:trPr>
               <w:tc>
                 <w:tcPr>
-                  <w:tcW w:w="1889" w:type="dxa"/>
+                  <w:tcW w:w="1871" w:type="dxa"/>
                   <w:tcBorders>
                     <w:top w:val="nil"/>
                     <w:left w:val="nil"/>
@@ -277,7 +279,7 @@
               </w:tc>
               <w:tc>
                 <w:tcPr>
-                  <w:tcW w:w="1259" w:type="dxa"/>
+                  <w:tcW w:w="1248" w:type="dxa"/>
                   <w:tcBorders>
                     <w:top w:val="nil"/>
                     <w:left w:val="nil"/>
@@ -320,7 +322,7 @@
               </w:tc>
               <w:tc>
                 <w:tcPr>
-                  <w:tcW w:w="1619" w:type="dxa"/>
+                  <w:tcW w:w="1604" w:type="dxa"/>
                   <w:tcBorders>
                     <w:top w:val="nil"/>
                     <w:left w:val="nil"/>

</xml_diff>

<commit_message>
Update horizontal template and Bothell database
Refresh the horizontal DOCX template and the AGT Bothell product database pointer.
</commit_message>
<xml_diff>
--- a/src/core/generation/templates/horizontal.docx
+++ b/src/core/generation/templates/horizontal.docx
@@ -168,62 +168,6 @@
               </w:rPr>
               <w:t>}}</w:t>
             </w:r>
-          </w:p>
-          <w:p>
-            <w:pPr>
-              <w:spacing w:line="216" w:lineRule="auto"/>
-              <w:ind w:right="126"/>
-              <w:rPr>
-                <w:rFonts w:ascii="Arial" w:hAnsi="Arial" w:cs="Arial"/>
-                <w:b/>
-                <w:bCs/>
-                <w:sz w:val="18"/>
-                <w:szCs w:val="18"/>
-              </w:rPr>
-            </w:pPr>
-            <w:r>
-              <w:rPr>
-                <w:rFonts w:ascii="Arial" w:hAnsi="Arial" w:cs="Arial"/>
-                <w:b/>
-                <w:bCs/>
-                <w:sz w:val="8"/>
-                <w:szCs w:val="8"/>
-              </w:rPr>
-              <w:t>{{Label1.Product</w:t>
-            </w:r>
-            <w:r>
-              <w:rPr>
-                <w:rFonts w:ascii="Arial" w:hAnsi="Arial" w:cs="Arial"/>
-                <w:b/>
-                <w:bCs/>
-                <w:sz w:val="8"/>
-                <w:szCs w:val="8"/>
-              </w:rPr>
-              <w:t>Vendor</w:t>
-            </w:r>
-            <w:r>
-              <w:rPr>
-                <w:rFonts w:ascii="Arial" w:hAnsi="Arial" w:cs="Arial"/>
-                <w:b/>
-                <w:bCs/>
-                <w:sz w:val="8"/>
-                <w:szCs w:val="8"/>
-              </w:rPr>
-              <w:t>}}</w:t>
-            </w:r>
-          </w:p>
-          <w:p>
-            <w:pPr>
-              <w:spacing w:line="216" w:lineRule="auto"/>
-              <w:ind w:right="126"/>
-              <w:rPr>
-                <w:rFonts w:ascii="Arial" w:hAnsi="Arial" w:cs="Arial"/>
-                <w:b/>
-                <w:bCs/>
-                <w:sz w:val="8"/>
-                <w:szCs w:val="8"/>
-              </w:rPr>
-            </w:pPr>
           </w:p>
           <w:p>
             <w:pPr>

</xml_diff>

<commit_message>
Fix: correct syntax error and add missing weight/doh fields to vertical/horizontal templates
Fixed critical syntax error in vertical template (duplicate vendor entry) that was
preventing the entire font sizing config from loading. Also added missing weight
and doh fields to both vertical and horizontal templates for complete field coverage.

Changes:
- Removed duplicate 'vendor' entry in vertical template (line 67)
- Added 'weight' and 'doh' fields to vertical template (lines 67-68)
- Added 'weight' and 'doh' fields to horizontal template (lines 79-80)

This fixes lineage colors and other features that depend on proper config loading.

🤖 Generated with [Claude Code](https://claude.com/claude-code)

Co-Authored-By: Claude Sonnet 4.5 <noreply@anthropic.com>
</commit_message>
<xml_diff>
--- a/src/core/generation/templates/horizontal.docx
+++ b/src/core/generation/templates/horizontal.docx
@@ -221,6 +221,19 @@
               </w:rPr>
               <w:t>}}</w:t>
             </w:r>
+          </w:p>
+          <w:p>
+            <w:pPr>
+              <w:spacing w:line="216" w:lineRule="auto"/>
+              <w:ind w:right="126"/>
+              <w:rPr>
+                <w:rFonts w:ascii="Arial" w:hAnsi="Arial" w:cs="Arial"/>
+                <w:b/>
+                <w:bCs/>
+                <w:sz w:val="18"/>
+                <w:szCs w:val="18"/>
+              </w:rPr>
+            </w:pPr>
           </w:p>
           <w:p>
             <w:pPr>

</xml_diff>

<commit_message>
Update Word templates for ProductVendor placeholder formatting
- Modified Double.docx, horizontal.docx, and vertical.docx templates
- Set ProductVendor placeholder text color to automatic/default
- Allows Python code to properly apply grey color (RGB 128,128,128)
- ProductVendor text will now display in grey and italic as intended

🤖 Generated with [Claude Code](https://claude.com/claude-code)

Co-Authored-By: Claude Sonnet 4.5 <noreply@anthropic.com>
</commit_message>
<xml_diff>
--- a/src/core/generation/templates/horizontal.docx
+++ b/src/core/generation/templates/horizontal.docx
@@ -135,9 +135,6 @@
                       <w:rFonts w:ascii="Arial" w:hAnsi="Arial" w:cs="Arial"/>
                       <w:b/>
                       <w:bCs/>
-                      <w:i/>
-                      <w:iCs/>
-                      <w:color w:val="808080" w:themeColor="background1" w:themeShade="80"/>
                       <w:sz w:val="8"/>
                       <w:szCs w:val="8"/>
                     </w:rPr>
@@ -147,9 +144,6 @@
                       <w:rFonts w:ascii="Arial" w:hAnsi="Arial" w:cs="Arial"/>
                       <w:b/>
                       <w:bCs/>
-                      <w:i/>
-                      <w:iCs/>
-                      <w:color w:val="808080" w:themeColor="background1" w:themeShade="80"/>
                       <w:sz w:val="8"/>
                       <w:szCs w:val="8"/>
                     </w:rPr>

</xml_diff>